<commit_message>
point collision detection fixed now
</commit_message>
<xml_diff>
--- a/CSY1063 AS2 Checklist Template.docx
+++ b/CSY1063 AS2 Checklist Template.docx
@@ -114,7 +114,7 @@
           <w:sdtPr>
             <w:id w:val="579108827"/>
             <w14:checkbox>
-              <w14:checked w14:val="0"/>
+              <w14:checked w14:val="1"/>
               <w14:checkedState w14:val="2612" w14:font="MS Gothic"/>
               <w14:uncheckedState w14:val="2610" w14:font="MS Gothic"/>
             </w14:checkbox>
@@ -134,7 +134,7 @@
                   <w:rPr>
                     <w:rFonts w:ascii="MS Gothic" w:eastAsia="MS Gothic" w:hAnsi="MS Gothic" w:hint="eastAsia"/>
                   </w:rPr>
-                  <w:t>☐</w:t>
+                  <w:t>☒</w:t>
                 </w:r>
               </w:p>
             </w:tc>

</xml_diff>

<commit_message>
implemented the point collision using area of elements
</commit_message>
<xml_diff>
--- a/CSY1063 AS2 Checklist Template.docx
+++ b/CSY1063 AS2 Checklist Template.docx
@@ -169,7 +169,7 @@
           <w:sdtPr>
             <w:id w:val="1123414663"/>
             <w14:checkbox>
-              <w14:checked w14:val="0"/>
+              <w14:checked w14:val="1"/>
               <w14:checkedState w14:val="2612" w14:font="MS Gothic"/>
               <w14:uncheckedState w14:val="2610" w14:font="MS Gothic"/>
             </w14:checkbox>
@@ -189,7 +189,7 @@
                   <w:rPr>
                     <w:rFonts w:ascii="MS Gothic" w:eastAsia="MS Gothic" w:hAnsi="MS Gothic" w:hint="eastAsia"/>
                   </w:rPr>
-                  <w:t>☐</w:t>
+                  <w:t>☒</w:t>
                 </w:r>
               </w:p>
             </w:tc>
@@ -234,7 +234,7 @@
           <w:sdtPr>
             <w:id w:val="-289361161"/>
             <w14:checkbox>
-              <w14:checked w14:val="0"/>
+              <w14:checked w14:val="1"/>
               <w14:checkedState w14:val="2612" w14:font="MS Gothic"/>
               <w14:uncheckedState w14:val="2610" w14:font="MS Gothic"/>
             </w14:checkbox>
@@ -254,7 +254,7 @@
                   <w:rPr>
                     <w:rFonts w:ascii="MS Gothic" w:eastAsia="MS Gothic" w:hAnsi="MS Gothic" w:hint="eastAsia"/>
                   </w:rPr>
-                  <w:t>☐</w:t>
+                  <w:t>☒</w:t>
                 </w:r>
               </w:p>
             </w:tc>
@@ -298,7 +298,7 @@
           <w:sdtPr>
             <w:id w:val="320391939"/>
             <w14:checkbox>
-              <w14:checked w14:val="0"/>
+              <w14:checked w14:val="1"/>
               <w14:checkedState w14:val="2612" w14:font="MS Gothic"/>
               <w14:uncheckedState w14:val="2610" w14:font="MS Gothic"/>
             </w14:checkbox>
@@ -318,7 +318,7 @@
                   <w:rPr>
                     <w:rFonts w:ascii="MS Gothic" w:eastAsia="MS Gothic" w:hAnsi="MS Gothic" w:hint="eastAsia"/>
                   </w:rPr>
-                  <w:t>☐</w:t>
+                  <w:t>☒</w:t>
                 </w:r>
               </w:p>
             </w:tc>
@@ -354,7 +354,7 @@
           <w:sdtPr>
             <w:id w:val="-1114904355"/>
             <w14:checkbox>
-              <w14:checked w14:val="0"/>
+              <w14:checked w14:val="1"/>
               <w14:checkedState w14:val="2612" w14:font="MS Gothic"/>
               <w14:uncheckedState w14:val="2610" w14:font="MS Gothic"/>
             </w14:checkbox>
@@ -374,7 +374,7 @@
                   <w:rPr>
                     <w:rFonts w:ascii="MS Gothic" w:eastAsia="MS Gothic" w:hAnsi="MS Gothic" w:hint="eastAsia"/>
                   </w:rPr>
-                  <w:t>☐</w:t>
+                  <w:t>☒</w:t>
                 </w:r>
               </w:p>
             </w:tc>

</xml_diff>

<commit_message>
unsuccessful attempt at enemy collision
</commit_message>
<xml_diff>
--- a/CSY1063 AS2 Checklist Template.docx
+++ b/CSY1063 AS2 Checklist Template.docx
@@ -409,7 +409,7 @@
           <w:sdtPr>
             <w:id w:val="1988663126"/>
             <w14:checkbox>
-              <w14:checked w14:val="0"/>
+              <w14:checked w14:val="1"/>
               <w14:checkedState w14:val="2612" w14:font="MS Gothic"/>
               <w14:uncheckedState w14:val="2610" w14:font="MS Gothic"/>
             </w14:checkbox>
@@ -429,7 +429,7 @@
                   <w:rPr>
                     <w:rFonts w:ascii="MS Gothic" w:eastAsia="MS Gothic" w:hAnsi="MS Gothic" w:hint="eastAsia"/>
                   </w:rPr>
-                  <w:t>☐</w:t>
+                  <w:t>☒</w:t>
                 </w:r>
               </w:p>
             </w:tc>

</xml_diff>

<commit_message>
Game Over message successful
</commit_message>
<xml_diff>
--- a/CSY1063 AS2 Checklist Template.docx
+++ b/CSY1063 AS2 Checklist Template.docx
@@ -470,7 +470,7 @@
           <w:sdtPr>
             <w:id w:val="-933977787"/>
             <w14:checkbox>
-              <w14:checked w14:val="0"/>
+              <w14:checked w14:val="1"/>
               <w14:checkedState w14:val="2612" w14:font="MS Gothic"/>
               <w14:uncheckedState w14:val="2610" w14:font="MS Gothic"/>
             </w14:checkbox>
@@ -490,7 +490,7 @@
                   <w:rPr>
                     <w:rFonts w:ascii="MS Gothic" w:eastAsia="MS Gothic" w:hAnsi="MS Gothic" w:hint="eastAsia"/>
                   </w:rPr>
-                  <w:t>☐</w:t>
+                  <w:t>☒</w:t>
                 </w:r>
               </w:p>
             </w:tc>
@@ -525,7 +525,7 @@
           <w:sdtPr>
             <w:id w:val="65163685"/>
             <w14:checkbox>
-              <w14:checked w14:val="0"/>
+              <w14:checked w14:val="1"/>
               <w14:checkedState w14:val="2612" w14:font="MS Gothic"/>
               <w14:uncheckedState w14:val="2610" w14:font="MS Gothic"/>
             </w14:checkbox>
@@ -545,7 +545,7 @@
                   <w:rPr>
                     <w:rFonts w:ascii="MS Gothic" w:eastAsia="MS Gothic" w:hAnsi="MS Gothic" w:hint="eastAsia"/>
                   </w:rPr>
-                  <w:t>☐</w:t>
+                  <w:t>☒</w:t>
                 </w:r>
               </w:p>
             </w:tc>
@@ -595,7 +595,7 @@
           <w:sdtPr>
             <w:id w:val="-1573737655"/>
             <w14:checkbox>
-              <w14:checked w14:val="0"/>
+              <w14:checked w14:val="1"/>
               <w14:checkedState w14:val="2612" w14:font="MS Gothic"/>
               <w14:uncheckedState w14:val="2610" w14:font="MS Gothic"/>
             </w14:checkbox>
@@ -615,7 +615,7 @@
                   <w:rPr>
                     <w:rFonts w:ascii="MS Gothic" w:eastAsia="MS Gothic" w:hAnsi="MS Gothic" w:hint="eastAsia"/>
                   </w:rPr>
-                  <w:t>☐</w:t>
+                  <w:t>☒</w:t>
                 </w:r>
               </w:p>
             </w:tc>

</xml_diff>

<commit_message>
word doc changes only
</commit_message>
<xml_diff>
--- a/CSY1063 AS2 Checklist Template.docx
+++ b/CSY1063 AS2 Checklist Template.docx
@@ -657,7 +657,7 @@
           <w:sdtPr>
             <w:id w:val="34945912"/>
             <w14:checkbox>
-              <w14:checked w14:val="0"/>
+              <w14:checked w14:val="1"/>
               <w14:checkedState w14:val="2612" w14:font="MS Gothic"/>
               <w14:uncheckedState w14:val="2610" w14:font="MS Gothic"/>
             </w14:checkbox>
@@ -677,7 +677,7 @@
                   <w:rPr>
                     <w:rFonts w:ascii="MS Gothic" w:eastAsia="MS Gothic" w:hAnsi="MS Gothic" w:hint="eastAsia"/>
                   </w:rPr>
-                  <w:t>☐</w:t>
+                  <w:t>☒</w:t>
                 </w:r>
               </w:p>
             </w:tc>

</xml_diff>

<commit_message>
random enemy position successfully implemented
</commit_message>
<xml_diff>
--- a/CSY1063 AS2 Checklist Template.docx
+++ b/CSY1063 AS2 Checklist Template.docx
@@ -724,7 +724,7 @@
           <w:sdtPr>
             <w:id w:val="1889138434"/>
             <w14:checkbox>
-              <w14:checked w14:val="0"/>
+              <w14:checked w14:val="1"/>
               <w14:checkedState w14:val="2612" w14:font="MS Gothic"/>
               <w14:uncheckedState w14:val="2610" w14:font="MS Gothic"/>
             </w14:checkbox>
@@ -744,7 +744,7 @@
                   <w:rPr>
                     <w:rFonts w:ascii="MS Gothic" w:eastAsia="MS Gothic" w:hAnsi="MS Gothic" w:hint="eastAsia"/>
                   </w:rPr>
-                  <w:t>☐</w:t>
+                  <w:t>☒</w:t>
                 </w:r>
               </w:p>
             </w:tc>
@@ -773,7 +773,7 @@
           <w:sdtPr>
             <w:id w:val="371737746"/>
             <w14:checkbox>
-              <w14:checked w14:val="0"/>
+              <w14:checked w14:val="1"/>
               <w14:checkedState w14:val="2612" w14:font="MS Gothic"/>
               <w14:uncheckedState w14:val="2610" w14:font="MS Gothic"/>
             </w14:checkbox>
@@ -793,7 +793,7 @@
                   <w:rPr>
                     <w:rFonts w:ascii="MS Gothic" w:eastAsia="MS Gothic" w:hAnsi="MS Gothic" w:hint="eastAsia"/>
                   </w:rPr>
-                  <w:t>☐</w:t>
+                  <w:t>☒</w:t>
                 </w:r>
               </w:p>
             </w:tc>
@@ -835,7 +835,7 @@
           <w:sdtPr>
             <w:id w:val="-653443508"/>
             <w14:checkbox>
-              <w14:checked w14:val="0"/>
+              <w14:checked w14:val="1"/>
               <w14:checkedState w14:val="2612" w14:font="MS Gothic"/>
               <w14:uncheckedState w14:val="2610" w14:font="MS Gothic"/>
             </w14:checkbox>
@@ -855,7 +855,7 @@
                   <w:rPr>
                     <w:rFonts w:ascii="MS Gothic" w:eastAsia="MS Gothic" w:hAnsi="MS Gothic" w:hint="eastAsia"/>
                   </w:rPr>
-                  <w:t>☐</w:t>
+                  <w:t>☒</w:t>
                 </w:r>
               </w:p>
             </w:tc>

</xml_diff>